<commit_message>
Kurs: blokada dzielnic, karta wyników, radio, pasek wiadomości o AI, Imas, biblioteka
Co-Authored-By: Claude Opus 5.5 <noreply@anthropic.com>
</commit_message>
<xml_diff>
--- a/pliki/sylabus_v2_2026-27.docx
+++ b/pliki/sylabus_v2_2026-27.docx
@@ -272,11 +272,7 @@
               <w:pStyle w:val="Compact"/>
             </w:pPr>
             <w:r>
-              <w:rPr>
-                <w:i/>
-                <w:iCs/>
-              </w:rPr>
-              <w:t xml:space="preserve">[adres strony kursu – do uzupełnienia po publikacji]</w:t>
+              <w:t xml:space="preserve">https://ingardenpl.github.io/ai-wyzwania/ (link także na https://kkasprowicz.com)</w:t>
             </w:r>
           </w:p>
         </w:tc>
@@ -2568,7 +2564,7 @@
         </w:numPr>
       </w:pPr>
       <w:r>
-        <w:t xml:space="preserve">Referat pisemny (10–15 stron) albo prezentacja z pisemnym opracowaniem (5–8 stron) na temat uzgodniony z prowadzącym do 4. spotkania.</w:t>
+        <w:t xml:space="preserve">Koncepcja aplikacji opartej na AI, która pomaga prawnikom w konkretnym zadaniu, wraz z planem wdrożenia (dokument 10–15 stron ze schematem działania i szkicem ekranów; prototyp nieobowiązkowy). Pomysł na aplikację trzeba uzgodnić z prowadzącym do 6 listopada 2026 r.</w:t>
       </w:r>
     </w:p>
     <w:p>
@@ -2580,7 +2576,19 @@
         </w:numPr>
       </w:pPr>
       <w:r>
-        <w:t xml:space="preserve">Kryteria: zawartość merytoryczna 40%, struktura wywodu 20%, wykorzystanie źródeł prawa, orzecznictwa i literatury 20%, jakość prezentacji lub redakcji tekstu 20%.</w:t>
+        <w:t xml:space="preserve">Projekt obejmuje: problem i użytkownika, koncepcję aplikacji, analizę prawną (AI Act, RODO, tajemnica zawodowa, odpowiedzialność, etyka zawodowa), ryzyka i zabezpieczenia oraz plan wdrożenia.</w:t>
+      </w:r>
+    </w:p>
+    <w:p>
+      <w:pPr>
+        <w:pStyle w:val="Compact"/>
+        <w:numPr>
+          <w:ilvl w:val="0"/>
+          <w:numId w:val="1013"/>
+        </w:numPr>
+      </w:pPr>
+      <w:r>
+        <w:t xml:space="preserve">Kryteria: koncepcja aplikacji i jej użyteczność 30%, analiza prawna i etyczna 30%, plan wdrożenia, ryzyka i nadzór człowieka 20%, źródła, struktura i redakcja 20%.</w:t>
       </w:r>
     </w:p>
     <w:p>
@@ -8138,6 +8146,240 @@
       <w:lang w:eastAsia="en-US"/>
     </w:rPr>
   </w:style>
+  <w:style w:customStyle="1" w:styleId="SourceCode" w:type="paragraph">
+    <w:name w:val="Source Code"/>
+    <w:basedOn w:val="Normal"/>
+    <w:link w:val="VerbatimChar"/>
+    <w:pPr>
+      <w:wordWrap w:val="off"/>
+    </w:pPr>
+  </w:style>
+  <w:style w:customStyle="1" w:styleId="KeywordTok" w:type="character">
+    <w:name w:val="KeywordTok"/>
+    <w:basedOn w:val="VerbatimChar"/>
+    <w:rPr>
+      <w:b/>
+      <w:color w:val="007020"/>
+    </w:rPr>
+  </w:style>
+  <w:style w:customStyle="1" w:styleId="DataTypeTok" w:type="character">
+    <w:name w:val="DataTypeTok"/>
+    <w:basedOn w:val="VerbatimChar"/>
+    <w:rPr>
+      <w:color w:val="902000"/>
+    </w:rPr>
+  </w:style>
+  <w:style w:customStyle="1" w:styleId="DecValTok" w:type="character">
+    <w:name w:val="DecValTok"/>
+    <w:basedOn w:val="VerbatimChar"/>
+    <w:rPr>
+      <w:color w:val="40a070"/>
+    </w:rPr>
+  </w:style>
+  <w:style w:customStyle="1" w:styleId="BaseNTok" w:type="character">
+    <w:name w:val="BaseNTok"/>
+    <w:basedOn w:val="VerbatimChar"/>
+    <w:rPr>
+      <w:color w:val="40a070"/>
+    </w:rPr>
+  </w:style>
+  <w:style w:customStyle="1" w:styleId="FloatTok" w:type="character">
+    <w:name w:val="FloatTok"/>
+    <w:basedOn w:val="VerbatimChar"/>
+    <w:rPr>
+      <w:color w:val="40a070"/>
+    </w:rPr>
+  </w:style>
+  <w:style w:customStyle="1" w:styleId="ConstantTok" w:type="character">
+    <w:name w:val="ConstantTok"/>
+    <w:basedOn w:val="VerbatimChar"/>
+    <w:rPr>
+      <w:color w:val="880000"/>
+    </w:rPr>
+  </w:style>
+  <w:style w:customStyle="1" w:styleId="CharTok" w:type="character">
+    <w:name w:val="CharTok"/>
+    <w:basedOn w:val="VerbatimChar"/>
+    <w:rPr>
+      <w:color w:val="4070a0"/>
+    </w:rPr>
+  </w:style>
+  <w:style w:customStyle="1" w:styleId="SpecialCharTok" w:type="character">
+    <w:name w:val="SpecialCharTok"/>
+    <w:basedOn w:val="VerbatimChar"/>
+    <w:rPr>
+      <w:color w:val="4070a0"/>
+    </w:rPr>
+  </w:style>
+  <w:style w:customStyle="1" w:styleId="StringTok" w:type="character">
+    <w:name w:val="StringTok"/>
+    <w:basedOn w:val="VerbatimChar"/>
+    <w:rPr>
+      <w:color w:val="4070a0"/>
+    </w:rPr>
+  </w:style>
+  <w:style w:customStyle="1" w:styleId="VerbatimStringTok" w:type="character">
+    <w:name w:val="VerbatimStringTok"/>
+    <w:basedOn w:val="VerbatimChar"/>
+    <w:rPr>
+      <w:color w:val="4070a0"/>
+    </w:rPr>
+  </w:style>
+  <w:style w:customStyle="1" w:styleId="SpecialStringTok" w:type="character">
+    <w:name w:val="SpecialStringTok"/>
+    <w:basedOn w:val="VerbatimChar"/>
+    <w:rPr>
+      <w:color w:val="bb6688"/>
+    </w:rPr>
+  </w:style>
+  <w:style w:customStyle="1" w:styleId="ImportTok" w:type="character">
+    <w:name w:val="ImportTok"/>
+    <w:basedOn w:val="VerbatimChar"/>
+    <w:rPr>
+      <w:b/>
+      <w:color w:val="008000"/>
+    </w:rPr>
+  </w:style>
+  <w:style w:customStyle="1" w:styleId="CommentTok" w:type="character">
+    <w:name w:val="CommentTok"/>
+    <w:basedOn w:val="VerbatimChar"/>
+    <w:rPr>
+      <w:i/>
+      <w:color w:val="60a0b0"/>
+    </w:rPr>
+  </w:style>
+  <w:style w:customStyle="1" w:styleId="DocumentationTok" w:type="character">
+    <w:name w:val="DocumentationTok"/>
+    <w:basedOn w:val="VerbatimChar"/>
+    <w:rPr>
+      <w:i/>
+      <w:color w:val="ba2121"/>
+    </w:rPr>
+  </w:style>
+  <w:style w:customStyle="1" w:styleId="AnnotationTok" w:type="character">
+    <w:name w:val="AnnotationTok"/>
+    <w:basedOn w:val="VerbatimChar"/>
+    <w:rPr>
+      <w:b/>
+      <w:i/>
+      <w:color w:val="60a0b0"/>
+    </w:rPr>
+  </w:style>
+  <w:style w:customStyle="1" w:styleId="CommentVarTok" w:type="character">
+    <w:name w:val="CommentVarTok"/>
+    <w:basedOn w:val="VerbatimChar"/>
+    <w:rPr>
+      <w:b/>
+      <w:i/>
+      <w:color w:val="60a0b0"/>
+    </w:rPr>
+  </w:style>
+  <w:style w:customStyle="1" w:styleId="OtherTok" w:type="character">
+    <w:name w:val="OtherTok"/>
+    <w:basedOn w:val="VerbatimChar"/>
+    <w:rPr>
+      <w:color w:val="007020"/>
+    </w:rPr>
+  </w:style>
+  <w:style w:customStyle="1" w:styleId="FunctionTok" w:type="character">
+    <w:name w:val="FunctionTok"/>
+    <w:basedOn w:val="VerbatimChar"/>
+    <w:rPr>
+      <w:color w:val="06287e"/>
+    </w:rPr>
+  </w:style>
+  <w:style w:customStyle="1" w:styleId="VariableTok" w:type="character">
+    <w:name w:val="VariableTok"/>
+    <w:basedOn w:val="VerbatimChar"/>
+    <w:rPr>
+      <w:color w:val="19177c"/>
+    </w:rPr>
+  </w:style>
+  <w:style w:customStyle="1" w:styleId="ControlFlowTok" w:type="character">
+    <w:name w:val="ControlFlowTok"/>
+    <w:basedOn w:val="VerbatimChar"/>
+    <w:rPr>
+      <w:b/>
+      <w:color w:val="007020"/>
+    </w:rPr>
+  </w:style>
+  <w:style w:customStyle="1" w:styleId="OperatorTok" w:type="character">
+    <w:name w:val="OperatorTok"/>
+    <w:basedOn w:val="VerbatimChar"/>
+    <w:rPr>
+      <w:color w:val="666666"/>
+    </w:rPr>
+  </w:style>
+  <w:style w:customStyle="1" w:styleId="BuiltInTok" w:type="character">
+    <w:name w:val="BuiltInTok"/>
+    <w:basedOn w:val="VerbatimChar"/>
+    <w:rPr>
+      <w:color w:val="008000"/>
+    </w:rPr>
+  </w:style>
+  <w:style w:customStyle="1" w:styleId="ExtensionTok" w:type="character">
+    <w:name w:val="ExtensionTok"/>
+    <w:basedOn w:val="VerbatimChar"/>
+    <w:rPr/>
+  </w:style>
+  <w:style w:customStyle="1" w:styleId="PreprocessorTok" w:type="character">
+    <w:name w:val="PreprocessorTok"/>
+    <w:basedOn w:val="VerbatimChar"/>
+    <w:rPr>
+      <w:color w:val="bc7a00"/>
+    </w:rPr>
+  </w:style>
+  <w:style w:customStyle="1" w:styleId="AttributeTok" w:type="character">
+    <w:name w:val="AttributeTok"/>
+    <w:basedOn w:val="VerbatimChar"/>
+    <w:rPr>
+      <w:color w:val="7d9029"/>
+    </w:rPr>
+  </w:style>
+  <w:style w:customStyle="1" w:styleId="RegionMarkerTok" w:type="character">
+    <w:name w:val="RegionMarkerTok"/>
+    <w:basedOn w:val="VerbatimChar"/>
+    <w:rPr/>
+  </w:style>
+  <w:style w:customStyle="1" w:styleId="InformationTok" w:type="character">
+    <w:name w:val="InformationTok"/>
+    <w:basedOn w:val="VerbatimChar"/>
+    <w:rPr>
+      <w:b/>
+      <w:i/>
+      <w:color w:val="60a0b0"/>
+    </w:rPr>
+  </w:style>
+  <w:style w:customStyle="1" w:styleId="WarningTok" w:type="character">
+    <w:name w:val="WarningTok"/>
+    <w:basedOn w:val="VerbatimChar"/>
+    <w:rPr>
+      <w:b/>
+      <w:i/>
+      <w:color w:val="60a0b0"/>
+    </w:rPr>
+  </w:style>
+  <w:style w:customStyle="1" w:styleId="AlertTok" w:type="character">
+    <w:name w:val="AlertTok"/>
+    <w:basedOn w:val="VerbatimChar"/>
+    <w:rPr>
+      <w:b/>
+      <w:color w:val="ff0000"/>
+    </w:rPr>
+  </w:style>
+  <w:style w:customStyle="1" w:styleId="ErrorTok" w:type="character">
+    <w:name w:val="ErrorTok"/>
+    <w:basedOn w:val="VerbatimChar"/>
+    <w:rPr>
+      <w:b/>
+      <w:color w:val="ff0000"/>
+    </w:rPr>
+  </w:style>
+  <w:style w:customStyle="1" w:styleId="NormalTok" w:type="character">
+    <w:name w:val="NormalTok"/>
+    <w:basedOn w:val="VerbatimChar"/>
+    <w:rPr/>
+  </w:style>
   <w:style w:type="paragraph" w:customStyle="1" w:styleId="SourceCode">
     <w:name w:val="Source Code"/>
     <w:basedOn w:val="Normal"/>

</xml_diff>

<commit_message>
Zaliczenie: ścieżka B 4–5 stron, ścieżka C (własna propozycja); baner bez drobnego podpisu
Co-Authored-By: Claude Opus 5.5 <noreply@anthropic.com>
</commit_message>
<xml_diff>
--- a/pliki/sylabus_v2_2026-27.docx
+++ b/pliki/sylabus_v2_2026-27.docx
@@ -496,7 +496,7 @@
               <w:pStyle w:val="Compact"/>
             </w:pPr>
             <w:r>
-              <w:t xml:space="preserve">Praca własna: przygotowanie do zaliczenia (test lub projekt)</w:t>
+              <w:t xml:space="preserve">Praca własna: przygotowanie do zaliczenia (test, projekt lub własna propozycja)</w:t>
             </w:r>
           </w:p>
         </w:tc>
@@ -1425,7 +1425,7 @@
               <w:pStyle w:val="Compact"/>
             </w:pPr>
             <w:r>
-              <w:t xml:space="preserve">test lub projekt</w:t>
+              <w:t xml:space="preserve">test, projekt lub praca własna (ścieżka C)</w:t>
             </w:r>
           </w:p>
         </w:tc>
@@ -1460,7 +1460,7 @@
               <w:pStyle w:val="Compact"/>
             </w:pPr>
             <w:r>
-              <w:t xml:space="preserve">test lub projekt</w:t>
+              <w:t xml:space="preserve">test, projekt lub praca własna (ścieżka C)</w:t>
             </w:r>
           </w:p>
         </w:tc>
@@ -2504,7 +2504,7 @@
         <w:t xml:space="preserve"> </w:t>
       </w:r>
       <w:r>
-        <w:t xml:space="preserve">zaliczenie na ocenę. Student wybiera jedną z dwóch ścieżek.</w:t>
+        <w:t xml:space="preserve">zaliczenie na ocenę. Student wybiera jedną z trzech ścieżek.</w:t>
       </w:r>
     </w:p>
     <w:p>
@@ -2564,7 +2564,7 @@
         </w:numPr>
       </w:pPr>
       <w:r>
-        <w:t xml:space="preserve">Koncepcja aplikacji opartej na AI, która pomaga prawnikom w konkretnym zadaniu, wraz z planem wdrożenia (dokument 10–15 stron ze schematem działania i szkicem ekranów; prototyp nieobowiązkowy). Pomysł na aplikację trzeba uzgodnić z prowadzącym do 6 listopada 2026 r.</w:t>
+        <w:t xml:space="preserve">Koncepcja aplikacji opartej na AI, która pomaga prawnikom w konkretnym zadaniu, wraz z planem wdrożenia (dokument 4–5 stron oraz załączniki: schemat działania i szkic ekranów; prototyp nieobowiązkowy). Pomysł na aplikację trzeba uzgodnić z prowadzącym do 6 listopada 2026 r.</w:t>
       </w:r>
     </w:p>
     <w:p>
@@ -2612,7 +2612,55 @@
           <w:b/>
           <w:bCs/>
         </w:rPr>
-        <w:t xml:space="preserve">Skala ocen (obie ścieżki).</w:t>
+        <w:t xml:space="preserve">Ścieżka C: własna propozycja studenta.</w:t>
+      </w:r>
+    </w:p>
+    <w:p>
+      <w:pPr>
+        <w:pStyle w:val="Compact"/>
+        <w:numPr>
+          <w:ilvl w:val="0"/>
+          <w:numId w:val="1014"/>
+        </w:numPr>
+      </w:pPr>
+      <w:r>
+        <w:t xml:space="preserve">Własna forma pracy związana z tematyką kursu (np. prototyp narzędzia AI dla prawników, analiza orzeczenia lub kazusu, artykuł popularnonaukowy, podcast lub film edukacyjny), zgłoszona z krótkim opisem do 6 listopada 2026 r. i zatwierdzona przez prowadzącego.</w:t>
+      </w:r>
+    </w:p>
+    <w:p>
+      <w:pPr>
+        <w:pStyle w:val="Compact"/>
+        <w:numPr>
+          <w:ilvl w:val="0"/>
+          <w:numId w:val="1014"/>
+        </w:numPr>
+      </w:pPr>
+      <w:r>
+        <w:t xml:space="preserve">Zakres porównywalny z projektem ze ścieżki B, z krótkim omówieniem pisemnym (1–2 strony) z podstawą prawną i źródłami; kryteria oceny ustala prowadzący przy zatwierdzeniu.</w:t>
+      </w:r>
+    </w:p>
+    <w:p>
+      <w:pPr>
+        <w:pStyle w:val="Compact"/>
+        <w:numPr>
+          <w:ilvl w:val="0"/>
+          <w:numId w:val="1014"/>
+        </w:numPr>
+      </w:pPr>
+      <w:r>
+        <w:t xml:space="preserve">Korzystanie z narzędzi AI jest dozwolone pod warunkiem dołączenia oświadczenia.</w:t>
+      </w:r>
+    </w:p>
+    <w:p>
+      <w:pPr>
+        <w:pStyle w:val="FirstParagraph"/>
+      </w:pPr>
+      <w:r>
+        <w:rPr>
+          <w:b/>
+          <w:bCs/>
+        </w:rPr>
+        <w:t xml:space="preserve">Skala ocen (wszystkie ścieżki).</w:t>
       </w:r>
     </w:p>
     <w:tbl>
@@ -2830,7 +2878,7 @@
         <w:t xml:space="preserve"> </w:t>
       </w:r>
       <w:r>
-        <w:t xml:space="preserve">Test i oddanie projektu w zimowej sesji zaliczeniowo-egzaminacyjnej (5–18 lutego 2027 r.); projekt najpóźniej do 18 lutego 2027 r.; termin poprawkowy do 28 lutego 2027 r.</w:t>
+        <w:t xml:space="preserve">Test oraz oddanie projektu (ścieżka B) i pracy własnej (ścieżka C) w zimowej sesji zaliczeniowo-egzaminacyjnej (5–18 lutego 2027 r.); projekt i pracę własną najpóźniej do 18 lutego 2027 r.; termin poprawkowy do 28 lutego 2027 r.</w:t>
       </w:r>
     </w:p>
     <w:bookmarkEnd w:id="19"/>
@@ -2857,7 +2905,7 @@
         <w:pStyle w:val="Compact"/>
         <w:numPr>
           <w:ilvl w:val="0"/>
-          <w:numId w:val="1014"/>
+          <w:numId w:val="1015"/>
         </w:numPr>
       </w:pPr>
       <w:r>
@@ -2869,7 +2917,7 @@
         <w:pStyle w:val="Compact"/>
         <w:numPr>
           <w:ilvl w:val="0"/>
-          <w:numId w:val="1014"/>
+          <w:numId w:val="1015"/>
         </w:numPr>
       </w:pPr>
       <w:r>
@@ -2881,7 +2929,7 @@
         <w:pStyle w:val="Compact"/>
         <w:numPr>
           <w:ilvl w:val="0"/>
-          <w:numId w:val="1014"/>
+          <w:numId w:val="1015"/>
         </w:numPr>
       </w:pPr>
       <w:r>
@@ -2906,7 +2954,7 @@
         <w:pStyle w:val="Compact"/>
         <w:numPr>
           <w:ilvl w:val="0"/>
-          <w:numId w:val="1014"/>
+          <w:numId w:val="1015"/>
         </w:numPr>
       </w:pPr>
       <w:r>
@@ -2931,7 +2979,7 @@
         <w:pStyle w:val="Compact"/>
         <w:numPr>
           <w:ilvl w:val="0"/>
-          <w:numId w:val="1014"/>
+          <w:numId w:val="1015"/>
         </w:numPr>
       </w:pPr>
       <w:r>
@@ -2956,7 +3004,7 @@
         <w:pStyle w:val="Compact"/>
         <w:numPr>
           <w:ilvl w:val="0"/>
-          <w:numId w:val="1014"/>
+          <w:numId w:val="1015"/>
         </w:numPr>
       </w:pPr>
       <w:r>
@@ -2981,7 +3029,7 @@
         <w:pStyle w:val="Compact"/>
         <w:numPr>
           <w:ilvl w:val="0"/>
-          <w:numId w:val="1014"/>
+          <w:numId w:val="1015"/>
         </w:numPr>
       </w:pPr>
       <w:r>
@@ -3016,7 +3064,7 @@
         <w:pStyle w:val="Compact"/>
         <w:numPr>
           <w:ilvl w:val="0"/>
-          <w:numId w:val="1015"/>
+          <w:numId w:val="1016"/>
         </w:numPr>
       </w:pPr>
       <w:r>
@@ -3028,7 +3076,7 @@
         <w:pStyle w:val="Compact"/>
         <w:numPr>
           <w:ilvl w:val="0"/>
-          <w:numId w:val="1015"/>
+          <w:numId w:val="1016"/>
         </w:numPr>
       </w:pPr>
       <w:r>
@@ -3040,7 +3088,7 @@
         <w:pStyle w:val="Compact"/>
         <w:numPr>
           <w:ilvl w:val="0"/>
-          <w:numId w:val="1015"/>
+          <w:numId w:val="1016"/>
         </w:numPr>
       </w:pPr>
       <w:r>
@@ -3052,7 +3100,7 @@
         <w:pStyle w:val="Compact"/>
         <w:numPr>
           <w:ilvl w:val="0"/>
-          <w:numId w:val="1015"/>
+          <w:numId w:val="1016"/>
         </w:numPr>
       </w:pPr>
       <w:r>
@@ -3064,7 +3112,7 @@
         <w:pStyle w:val="Compact"/>
         <w:numPr>
           <w:ilvl w:val="0"/>
-          <w:numId w:val="1015"/>
+          <w:numId w:val="1016"/>
         </w:numPr>
       </w:pPr>
       <w:r>
@@ -3076,7 +3124,7 @@
         <w:pStyle w:val="Compact"/>
         <w:numPr>
           <w:ilvl w:val="0"/>
-          <w:numId w:val="1015"/>
+          <w:numId w:val="1016"/>
         </w:numPr>
       </w:pPr>
       <w:r>
@@ -3088,7 +3136,7 @@
         <w:pStyle w:val="Compact"/>
         <w:numPr>
           <w:ilvl w:val="0"/>
-          <w:numId w:val="1015"/>
+          <w:numId w:val="1016"/>
         </w:numPr>
       </w:pPr>
       <w:r>
@@ -3100,7 +3148,7 @@
         <w:pStyle w:val="Compact"/>
         <w:numPr>
           <w:ilvl w:val="0"/>
-          <w:numId w:val="1015"/>
+          <w:numId w:val="1016"/>
         </w:numPr>
       </w:pPr>
       <w:r>
@@ -3112,7 +3160,7 @@
         <w:pStyle w:val="Compact"/>
         <w:numPr>
           <w:ilvl w:val="0"/>
-          <w:numId w:val="1015"/>
+          <w:numId w:val="1016"/>
         </w:numPr>
       </w:pPr>
       <w:r>
@@ -3124,7 +3172,7 @@
         <w:pStyle w:val="Compact"/>
         <w:numPr>
           <w:ilvl w:val="0"/>
-          <w:numId w:val="1015"/>
+          <w:numId w:val="1016"/>
         </w:numPr>
       </w:pPr>
       <w:r>
@@ -3149,7 +3197,7 @@
         <w:pStyle w:val="Compact"/>
         <w:numPr>
           <w:ilvl w:val="0"/>
-          <w:numId w:val="1015"/>
+          <w:numId w:val="1016"/>
         </w:numPr>
       </w:pPr>
       <w:r>
@@ -3184,7 +3232,7 @@
         <w:pStyle w:val="Compact"/>
         <w:numPr>
           <w:ilvl w:val="0"/>
-          <w:numId w:val="1016"/>
+          <w:numId w:val="1017"/>
         </w:numPr>
       </w:pPr>
       <w:r>
@@ -3209,7 +3257,7 @@
         <w:pStyle w:val="Compact"/>
         <w:numPr>
           <w:ilvl w:val="0"/>
-          <w:numId w:val="1016"/>
+          <w:numId w:val="1017"/>
         </w:numPr>
       </w:pPr>
       <w:r>
@@ -3234,7 +3282,7 @@
         <w:pStyle w:val="Compact"/>
         <w:numPr>
           <w:ilvl w:val="0"/>
-          <w:numId w:val="1016"/>
+          <w:numId w:val="1017"/>
         </w:numPr>
       </w:pPr>
       <w:r>
@@ -3246,7 +3294,7 @@
         <w:pStyle w:val="Compact"/>
         <w:numPr>
           <w:ilvl w:val="0"/>
-          <w:numId w:val="1016"/>
+          <w:numId w:val="1017"/>
         </w:numPr>
       </w:pPr>
       <w:r>
@@ -3265,7 +3313,7 @@
         <w:pStyle w:val="Compact"/>
         <w:numPr>
           <w:ilvl w:val="0"/>
-          <w:numId w:val="1016"/>
+          <w:numId w:val="1017"/>
         </w:numPr>
       </w:pPr>
       <w:r>
@@ -3284,7 +3332,7 @@
         <w:pStyle w:val="Compact"/>
         <w:numPr>
           <w:ilvl w:val="0"/>
-          <w:numId w:val="1016"/>
+          <w:numId w:val="1017"/>
         </w:numPr>
       </w:pPr>
       <w:r>
@@ -3303,7 +3351,7 @@
         <w:pStyle w:val="Compact"/>
         <w:numPr>
           <w:ilvl w:val="0"/>
-          <w:numId w:val="1016"/>
+          <w:numId w:val="1017"/>
         </w:numPr>
       </w:pPr>
       <w:r>
@@ -3322,7 +3370,7 @@
         <w:pStyle w:val="Compact"/>
         <w:numPr>
           <w:ilvl w:val="0"/>
-          <w:numId w:val="1016"/>
+          <w:numId w:val="1017"/>
         </w:numPr>
       </w:pPr>
       <w:r>
@@ -3347,7 +3395,7 @@
         <w:pStyle w:val="Compact"/>
         <w:numPr>
           <w:ilvl w:val="0"/>
-          <w:numId w:val="1016"/>
+          <w:numId w:val="1017"/>
         </w:numPr>
       </w:pPr>
       <w:r>
@@ -3366,7 +3414,7 @@
         <w:pStyle w:val="Compact"/>
         <w:numPr>
           <w:ilvl w:val="0"/>
-          <w:numId w:val="1016"/>
+          <w:numId w:val="1017"/>
         </w:numPr>
       </w:pPr>
       <w:r>
@@ -3385,7 +3433,7 @@
         <w:pStyle w:val="Compact"/>
         <w:numPr>
           <w:ilvl w:val="0"/>
-          <w:numId w:val="1016"/>
+          <w:numId w:val="1017"/>
         </w:numPr>
       </w:pPr>
       <w:r>
@@ -3423,7 +3471,7 @@
         <w:pStyle w:val="Compact"/>
         <w:numPr>
           <w:ilvl w:val="0"/>
-          <w:numId w:val="1017"/>
+          <w:numId w:val="1018"/>
         </w:numPr>
       </w:pPr>
       <w:r>
@@ -3448,7 +3496,7 @@
         <w:pStyle w:val="Compact"/>
         <w:numPr>
           <w:ilvl w:val="0"/>
-          <w:numId w:val="1017"/>
+          <w:numId w:val="1018"/>
         </w:numPr>
       </w:pPr>
       <w:r>
@@ -3460,7 +3508,7 @@
         <w:pStyle w:val="Compact"/>
         <w:numPr>
           <w:ilvl w:val="0"/>
-          <w:numId w:val="1017"/>
+          <w:numId w:val="1018"/>
         </w:numPr>
       </w:pPr>
       <w:r>
@@ -3472,7 +3520,7 @@
         <w:pStyle w:val="Compact"/>
         <w:numPr>
           <w:ilvl w:val="0"/>
-          <w:numId w:val="1017"/>
+          <w:numId w:val="1018"/>
         </w:numPr>
       </w:pPr>
       <w:r>
@@ -3497,7 +3545,7 @@
         <w:pStyle w:val="Compact"/>
         <w:numPr>
           <w:ilvl w:val="0"/>
-          <w:numId w:val="1017"/>
+          <w:numId w:val="1018"/>
         </w:numPr>
       </w:pPr>
       <w:r>
@@ -3522,7 +3570,7 @@
         <w:pStyle w:val="Compact"/>
         <w:numPr>
           <w:ilvl w:val="0"/>
-          <w:numId w:val="1017"/>
+          <w:numId w:val="1018"/>
         </w:numPr>
       </w:pPr>
       <w:r>
@@ -3547,7 +3595,7 @@
         <w:pStyle w:val="Compact"/>
         <w:numPr>
           <w:ilvl w:val="0"/>
-          <w:numId w:val="1017"/>
+          <w:numId w:val="1018"/>
         </w:numPr>
       </w:pPr>
       <w:r>
@@ -3572,7 +3620,7 @@
         <w:pStyle w:val="Compact"/>
         <w:numPr>
           <w:ilvl w:val="0"/>
-          <w:numId w:val="1017"/>
+          <w:numId w:val="1018"/>
         </w:numPr>
       </w:pPr>
       <w:r>
@@ -3584,7 +3632,7 @@
         <w:pStyle w:val="Compact"/>
         <w:numPr>
           <w:ilvl w:val="0"/>
-          <w:numId w:val="1017"/>
+          <w:numId w:val="1018"/>
         </w:numPr>
       </w:pPr>
       <w:r>
@@ -3596,7 +3644,7 @@
         <w:pStyle w:val="Compact"/>
         <w:numPr>
           <w:ilvl w:val="0"/>
-          <w:numId w:val="1017"/>
+          <w:numId w:val="1018"/>
         </w:numPr>
       </w:pPr>
       <w:r>
@@ -3621,7 +3669,7 @@
         <w:pStyle w:val="Compact"/>
         <w:numPr>
           <w:ilvl w:val="0"/>
-          <w:numId w:val="1017"/>
+          <w:numId w:val="1018"/>
         </w:numPr>
       </w:pPr>
       <w:r>
@@ -3633,7 +3681,7 @@
         <w:pStyle w:val="Compact"/>
         <w:numPr>
           <w:ilvl w:val="0"/>
-          <w:numId w:val="1017"/>
+          <w:numId w:val="1018"/>
         </w:numPr>
       </w:pPr>
       <w:r>
@@ -3658,7 +3706,7 @@
         <w:pStyle w:val="Compact"/>
         <w:numPr>
           <w:ilvl w:val="0"/>
-          <w:numId w:val="1017"/>
+          <w:numId w:val="1018"/>
         </w:numPr>
       </w:pPr>
       <w:r>
@@ -3683,7 +3731,7 @@
         <w:pStyle w:val="Compact"/>
         <w:numPr>
           <w:ilvl w:val="0"/>
-          <w:numId w:val="1017"/>
+          <w:numId w:val="1018"/>
         </w:numPr>
       </w:pPr>
       <w:r>
@@ -3708,7 +3756,7 @@
         <w:pStyle w:val="Compact"/>
         <w:numPr>
           <w:ilvl w:val="0"/>
-          <w:numId w:val="1017"/>
+          <w:numId w:val="1018"/>
         </w:numPr>
       </w:pPr>
       <w:r>
@@ -3733,7 +3781,7 @@
         <w:pStyle w:val="Compact"/>
         <w:numPr>
           <w:ilvl w:val="0"/>
-          <w:numId w:val="1017"/>
+          <w:numId w:val="1018"/>
         </w:numPr>
       </w:pPr>
       <w:r>
@@ -3745,7 +3793,7 @@
         <w:pStyle w:val="Compact"/>
         <w:numPr>
           <w:ilvl w:val="0"/>
-          <w:numId w:val="1017"/>
+          <w:numId w:val="1018"/>
         </w:numPr>
       </w:pPr>
       <w:r>
@@ -3770,7 +3818,7 @@
         <w:pStyle w:val="Compact"/>
         <w:numPr>
           <w:ilvl w:val="0"/>
-          <w:numId w:val="1017"/>
+          <w:numId w:val="1018"/>
         </w:numPr>
       </w:pPr>
       <w:r>
@@ -3795,7 +3843,7 @@
         <w:pStyle w:val="Compact"/>
         <w:numPr>
           <w:ilvl w:val="0"/>
-          <w:numId w:val="1017"/>
+          <w:numId w:val="1018"/>
         </w:numPr>
       </w:pPr>
       <w:r>
@@ -3820,7 +3868,7 @@
         <w:pStyle w:val="Compact"/>
         <w:numPr>
           <w:ilvl w:val="0"/>
-          <w:numId w:val="1017"/>
+          <w:numId w:val="1018"/>
         </w:numPr>
       </w:pPr>
       <w:r>
@@ -3845,7 +3893,7 @@
         <w:pStyle w:val="Compact"/>
         <w:numPr>
           <w:ilvl w:val="0"/>
-          <w:numId w:val="1017"/>
+          <w:numId w:val="1018"/>
         </w:numPr>
       </w:pPr>
       <w:r>
@@ -3873,7 +3921,7 @@
         <w:pStyle w:val="Compact"/>
         <w:numPr>
           <w:ilvl w:val="0"/>
-          <w:numId w:val="1017"/>
+          <w:numId w:val="1018"/>
         </w:numPr>
       </w:pPr>
       <w:r>
@@ -3898,7 +3946,7 @@
         <w:pStyle w:val="Compact"/>
         <w:numPr>
           <w:ilvl w:val="0"/>
-          <w:numId w:val="1017"/>
+          <w:numId w:val="1018"/>
         </w:numPr>
       </w:pPr>
       <w:r>
@@ -3923,7 +3971,7 @@
         <w:pStyle w:val="Compact"/>
         <w:numPr>
           <w:ilvl w:val="0"/>
-          <w:numId w:val="1017"/>
+          <w:numId w:val="1018"/>
         </w:numPr>
       </w:pPr>
       <w:r>
@@ -3948,7 +3996,7 @@
         <w:pStyle w:val="Compact"/>
         <w:numPr>
           <w:ilvl w:val="0"/>
-          <w:numId w:val="1017"/>
+          <w:numId w:val="1018"/>
         </w:numPr>
       </w:pPr>
       <w:r>
@@ -3960,7 +4008,7 @@
         <w:pStyle w:val="Compact"/>
         <w:numPr>
           <w:ilvl w:val="0"/>
-          <w:numId w:val="1017"/>
+          <w:numId w:val="1018"/>
         </w:numPr>
       </w:pPr>
       <w:r>
@@ -3985,7 +4033,7 @@
         <w:pStyle w:val="Compact"/>
         <w:numPr>
           <w:ilvl w:val="0"/>
-          <w:numId w:val="1017"/>
+          <w:numId w:val="1018"/>
         </w:numPr>
       </w:pPr>
       <w:r>
@@ -3997,7 +4045,7 @@
         <w:pStyle w:val="Compact"/>
         <w:numPr>
           <w:ilvl w:val="0"/>
-          <w:numId w:val="1017"/>
+          <w:numId w:val="1018"/>
         </w:numPr>
       </w:pPr>
       <w:r>
@@ -4022,7 +4070,7 @@
         <w:pStyle w:val="Compact"/>
         <w:numPr>
           <w:ilvl w:val="0"/>
-          <w:numId w:val="1017"/>
+          <w:numId w:val="1018"/>
         </w:numPr>
       </w:pPr>
       <w:r>
@@ -4050,7 +4098,7 @@
         <w:pStyle w:val="Compact"/>
         <w:numPr>
           <w:ilvl w:val="0"/>
-          <w:numId w:val="1017"/>
+          <w:numId w:val="1018"/>
         </w:numPr>
       </w:pPr>
       <w:r>
@@ -4078,7 +4126,7 @@
         <w:pStyle w:val="Compact"/>
         <w:numPr>
           <w:ilvl w:val="0"/>
-          <w:numId w:val="1017"/>
+          <w:numId w:val="1018"/>
         </w:numPr>
       </w:pPr>
       <w:r>
@@ -4103,7 +4151,7 @@
         <w:pStyle w:val="Compact"/>
         <w:numPr>
           <w:ilvl w:val="0"/>
-          <w:numId w:val="1017"/>
+          <w:numId w:val="1018"/>
         </w:numPr>
       </w:pPr>
       <w:r>
@@ -4128,7 +4176,7 @@
         <w:pStyle w:val="Compact"/>
         <w:numPr>
           <w:ilvl w:val="0"/>
-          <w:numId w:val="1017"/>
+          <w:numId w:val="1018"/>
         </w:numPr>
       </w:pPr>
       <w:r>
@@ -4140,7 +4188,7 @@
         <w:pStyle w:val="Compact"/>
         <w:numPr>
           <w:ilvl w:val="0"/>
-          <w:numId w:val="1017"/>
+          <w:numId w:val="1018"/>
         </w:numPr>
       </w:pPr>
       <w:r>
@@ -4165,7 +4213,7 @@
         <w:pStyle w:val="Compact"/>
         <w:numPr>
           <w:ilvl w:val="0"/>
-          <w:numId w:val="1017"/>
+          <w:numId w:val="1018"/>
         </w:numPr>
       </w:pPr>
       <w:r>
@@ -4190,7 +4238,7 @@
         <w:pStyle w:val="Compact"/>
         <w:numPr>
           <w:ilvl w:val="0"/>
-          <w:numId w:val="1017"/>
+          <w:numId w:val="1018"/>
         </w:numPr>
       </w:pPr>
       <w:r>
@@ -4215,7 +4263,7 @@
         <w:pStyle w:val="Compact"/>
         <w:numPr>
           <w:ilvl w:val="0"/>
-          <w:numId w:val="1017"/>
+          <w:numId w:val="1018"/>
         </w:numPr>
       </w:pPr>
       <w:r>
@@ -4240,7 +4288,7 @@
         <w:pStyle w:val="Compact"/>
         <w:numPr>
           <w:ilvl w:val="0"/>
-          <w:numId w:val="1017"/>
+          <w:numId w:val="1018"/>
         </w:numPr>
       </w:pPr>
       <w:r>
@@ -4265,7 +4313,7 @@
         <w:pStyle w:val="Compact"/>
         <w:numPr>
           <w:ilvl w:val="0"/>
-          <w:numId w:val="1017"/>
+          <w:numId w:val="1018"/>
         </w:numPr>
       </w:pPr>
       <w:r>
@@ -4290,7 +4338,7 @@
         <w:pStyle w:val="Compact"/>
         <w:numPr>
           <w:ilvl w:val="0"/>
-          <w:numId w:val="1017"/>
+          <w:numId w:val="1018"/>
         </w:numPr>
       </w:pPr>
       <w:r>
@@ -4315,7 +4363,7 @@
         <w:pStyle w:val="Compact"/>
         <w:numPr>
           <w:ilvl w:val="0"/>
-          <w:numId w:val="1017"/>
+          <w:numId w:val="1018"/>
         </w:numPr>
       </w:pPr>
       <w:r>
@@ -4343,7 +4391,7 @@
         <w:pStyle w:val="Compact"/>
         <w:numPr>
           <w:ilvl w:val="0"/>
-          <w:numId w:val="1017"/>
+          <w:numId w:val="1018"/>
         </w:numPr>
       </w:pPr>
       <w:r>
@@ -4368,7 +4416,7 @@
         <w:pStyle w:val="Compact"/>
         <w:numPr>
           <w:ilvl w:val="0"/>
-          <w:numId w:val="1017"/>
+          <w:numId w:val="1018"/>
         </w:numPr>
       </w:pPr>
       <w:r>
@@ -4393,7 +4441,7 @@
         <w:pStyle w:val="Compact"/>
         <w:numPr>
           <w:ilvl w:val="0"/>
-          <w:numId w:val="1017"/>
+          <w:numId w:val="1018"/>
         </w:numPr>
       </w:pPr>
       <w:r>
@@ -4421,7 +4469,7 @@
         <w:pStyle w:val="Compact"/>
         <w:numPr>
           <w:ilvl w:val="0"/>
-          <w:numId w:val="1017"/>
+          <w:numId w:val="1018"/>
         </w:numPr>
       </w:pPr>
       <w:r>
@@ -4446,7 +4494,7 @@
         <w:pStyle w:val="Compact"/>
         <w:numPr>
           <w:ilvl w:val="0"/>
-          <w:numId w:val="1017"/>
+          <w:numId w:val="1018"/>
         </w:numPr>
       </w:pPr>
       <w:r>
@@ -4471,7 +4519,7 @@
         <w:pStyle w:val="Compact"/>
         <w:numPr>
           <w:ilvl w:val="0"/>
-          <w:numId w:val="1017"/>
+          <w:numId w:val="1018"/>
         </w:numPr>
       </w:pPr>
       <w:r>
@@ -4496,7 +4544,7 @@
         <w:pStyle w:val="Compact"/>
         <w:numPr>
           <w:ilvl w:val="0"/>
-          <w:numId w:val="1017"/>
+          <w:numId w:val="1018"/>
         </w:numPr>
       </w:pPr>
       <w:r>
@@ -4508,7 +4556,7 @@
         <w:pStyle w:val="Compact"/>
         <w:numPr>
           <w:ilvl w:val="0"/>
-          <w:numId w:val="1017"/>
+          <w:numId w:val="1018"/>
         </w:numPr>
       </w:pPr>
       <w:r>
@@ -7481,6 +7529,9 @@
     <w:abstractNumId w:val="991"/>
   </w:num>
   <w:num w:numId="1014">
+    <w:abstractNumId w:val="991"/>
+  </w:num>
+  <w:num w:numId="1015">
     <w:abstractNumId w:val="99411"/>
     <w:lvlOverride w:ilvl="0">
       <w:startOverride w:val="1"/>
@@ -7510,13 +7561,13 @@
       <w:startOverride w:val="1"/>
     </w:lvlOverride>
   </w:num>
-  <w:num w:numId="1015">
-    <w:abstractNumId w:val="991"/>
-  </w:num>
   <w:num w:numId="1016">
     <w:abstractNumId w:val="991"/>
   </w:num>
   <w:num w:numId="1017">
+    <w:abstractNumId w:val="991"/>
+  </w:num>
+  <w:num w:numId="1018">
     <w:abstractNumId w:val="991"/>
   </w:num>
 </w:numbering>

</xml_diff>